<commit_message>
Update final_report.docx with the latest revisions and enhancements.
</commit_message>
<xml_diff>
--- a/reports/final_report.docx
+++ b/reports/final_report.docx
@@ -158,7 +158,38 @@
       </w:pPr>
       <w:bookmarkStart w:id="12" w:name="Xb55e57e487ed67d5a48b9726cbfab727767bd72"/>
       <w:r>
-        <w:t>Руководитель практики: _________________________________</w:t>
+        <w:t xml:space="preserve">Руководитель практики: </w:t>
+      </w:r>
+    </w:p>
+    <w:p>
+      <w:pPr>
+        <w:pStyle w:val="2"/>
+        <w:jc w:val="center"/>
+      </w:pPr>
+      <w:r>
+        <w:t>______</w:t>
+      </w:r>
+      <w:r>
+        <w:rPr>
+          <w:rFonts w:hint="default" w:ascii="Arial Bold" w:hAnsi="Arial Bold" w:eastAsia="Arial" w:cs="Arial Bold"/>
+          <w:b/>
+          <w:bCs/>
+          <w:i w:val="0"/>
+          <w:iCs w:val="0"/>
+          <w:caps w:val="0"/>
+          <w:color w:val="333333"/>
+          <w:spacing w:val="0"/>
+          <w:kern w:val="0"/>
+          <w:sz w:val="32"/>
+          <w:szCs w:val="32"/>
+          <w:u w:val="single"/>
+          <w:shd w:val="clear" w:fill="FFFFFF"/>
+          <w:lang w:val="en-US" w:eastAsia="zh-CN" w:bidi="ar"/>
+        </w:rPr>
+        <w:t>Чернова Вера Михайловна</w:t>
+      </w:r>
+      <w:r>
+        <w:t>________</w:t>
       </w:r>
     </w:p>
     <w:bookmarkEnd w:id="12"/>
@@ -179,6 +210,8 @@
       <w:r>
         <w:t>ОГЛАВЛЕНИЕ</w:t>
       </w:r>
+      <w:bookmarkStart w:id="87" w:name="_GoBack"/>
+      <w:bookmarkEnd w:id="87"/>
     </w:p>
     <w:p>
       <w:pPr>
@@ -541,8 +574,6 @@
       <w:r>
         <w:t>ОБЩАЯ ИНФОРМАЦИЯ О ПРОЕКТЕ</w:t>
       </w:r>
-      <w:bookmarkStart w:id="87" w:name="_GoBack"/>
-      <w:bookmarkEnd w:id="87"/>
     </w:p>
     <w:p>
       <w:pPr>
@@ -8737,7 +8768,7 @@
   <w:docDefaults>
     <w:rPrDefault>
       <w:rPr>
-        <w:rFonts w:asciiTheme="minorHAnsi" w:hAnsiTheme="minorHAnsi" w:eastAsiaTheme="minorHAnsi" w:cstheme="minorBidi"/>
+        <w:rFonts w:ascii="Times New Roman" w:hAnsi="Times New Roman" w:eastAsia="SimSun" w:cs="Times New Roman"/>
       </w:rPr>
     </w:rPrDefault>
     <w:pPrDefault/>

</xml_diff>